<commit_message>
Actualizar materiales y datasets
</commit_message>
<xml_diff>
--- a/Modulo 3 - Power BI Nivel 2/semana-1/El Negocio.docx
+++ b/Modulo 3 - Power BI Nivel 2/semana-1/El Negocio.docx
@@ -4,7 +4,7 @@
   <w:body>
     <w:p>
       <w:pPr>
-        <w:spacing w:line="276" w:lineRule="auto"/>
+        <w:spacing w:after="0" w:line="360" w:lineRule="auto"/>
         <w:jc w:val="center"/>
         <w:rPr>
           <w:b/>
@@ -25,7 +25,7 @@
     </w:p>
     <w:p>
       <w:pPr>
-        <w:spacing w:line="276" w:lineRule="auto"/>
+        <w:spacing w:after="0" w:line="360" w:lineRule="auto"/>
       </w:pPr>
     </w:p>
     <w:p>
@@ -35,7 +35,7 @@
           <w:ilvl w:val="0"/>
           <w:numId w:val="2"/>
         </w:numPr>
-        <w:spacing w:line="276" w:lineRule="auto"/>
+        <w:spacing w:after="0" w:line="360" w:lineRule="auto"/>
         <w:rPr>
           <w:b/>
           <w:bCs/>
@@ -51,7 +51,7 @@
     </w:p>
     <w:p>
       <w:pPr>
-        <w:spacing w:line="276" w:lineRule="auto"/>
+        <w:spacing w:after="0" w:line="360" w:lineRule="auto"/>
         <w:ind w:left="360"/>
       </w:pPr>
       <w:r>
@@ -74,7 +74,7 @@
           <w:ilvl w:val="0"/>
           <w:numId w:val="2"/>
         </w:numPr>
-        <w:spacing w:line="276" w:lineRule="auto"/>
+        <w:spacing w:after="0" w:line="360" w:lineRule="auto"/>
         <w:rPr>
           <w:b/>
           <w:bCs/>
@@ -90,7 +90,7 @@
     </w:p>
     <w:p>
       <w:pPr>
-        <w:spacing w:line="276" w:lineRule="auto"/>
+        <w:spacing w:after="0" w:line="360" w:lineRule="auto"/>
         <w:ind w:left="360"/>
       </w:pPr>
       <w:r>
@@ -104,7 +104,7 @@
           <w:ilvl w:val="0"/>
           <w:numId w:val="4"/>
         </w:numPr>
-        <w:spacing w:line="276" w:lineRule="auto"/>
+        <w:spacing w:after="0" w:line="360" w:lineRule="auto"/>
       </w:pPr>
       <w:r>
         <w:t>Género (Femenino / Masculino)</w:t>
@@ -117,9 +117,15 @@
           <w:ilvl w:val="0"/>
           <w:numId w:val="4"/>
         </w:numPr>
-        <w:spacing w:line="276" w:lineRule="auto"/>
-      </w:pPr>
-      <w:r>
+        <w:spacing w:after="0" w:line="360" w:lineRule="auto"/>
+        <w:rPr>
+          <w:color w:val="FF0000"/>
+        </w:rPr>
+      </w:pPr>
+      <w:r>
+        <w:rPr>
+          <w:color w:val="FF0000"/>
+        </w:rPr>
         <w:t>Edad</w:t>
       </w:r>
     </w:p>
@@ -130,7 +136,7 @@
           <w:ilvl w:val="0"/>
           <w:numId w:val="4"/>
         </w:numPr>
-        <w:spacing w:line="276" w:lineRule="auto"/>
+        <w:spacing w:after="0" w:line="360" w:lineRule="auto"/>
       </w:pPr>
       <w:r>
         <w:t>Salario</w:t>
@@ -143,7 +149,7 @@
           <w:ilvl w:val="0"/>
           <w:numId w:val="4"/>
         </w:numPr>
-        <w:spacing w:line="276" w:lineRule="auto"/>
+        <w:spacing w:after="0" w:line="360" w:lineRule="auto"/>
       </w:pPr>
       <w:r>
         <w:t>Antigüedad</w:t>
@@ -156,7 +162,7 @@
           <w:ilvl w:val="0"/>
           <w:numId w:val="4"/>
         </w:numPr>
-        <w:spacing w:line="276" w:lineRule="auto"/>
+        <w:spacing w:after="0" w:line="360" w:lineRule="auto"/>
       </w:pPr>
       <w:r>
         <w:t>Peso</w:t>
@@ -169,7 +175,7 @@
           <w:ilvl w:val="0"/>
           <w:numId w:val="4"/>
         </w:numPr>
-        <w:spacing w:line="276" w:lineRule="auto"/>
+        <w:spacing w:after="0" w:line="360" w:lineRule="auto"/>
       </w:pPr>
       <w:r>
         <w:t>Lugar de trabajo (condado, ciudad, estado, país)</w:t>
@@ -178,7 +184,7 @@
     <w:p>
       <w:pPr>
         <w:pStyle w:val="Prrafodelista"/>
-        <w:spacing w:line="276" w:lineRule="auto"/>
+        <w:spacing w:after="0" w:line="360" w:lineRule="auto"/>
       </w:pPr>
     </w:p>
     <w:p>
@@ -188,7 +194,7 @@
           <w:ilvl w:val="0"/>
           <w:numId w:val="2"/>
         </w:numPr>
-        <w:spacing w:line="276" w:lineRule="auto"/>
+        <w:spacing w:after="0" w:line="360" w:lineRule="auto"/>
         <w:rPr>
           <w:b/>
           <w:bCs/>
@@ -211,7 +217,7 @@
     </w:p>
     <w:p>
       <w:pPr>
-        <w:spacing w:line="276" w:lineRule="auto"/>
+        <w:spacing w:after="0" w:line="360" w:lineRule="auto"/>
         <w:ind w:left="360"/>
       </w:pPr>
       <w:r>
@@ -225,7 +231,7 @@
           <w:ilvl w:val="0"/>
           <w:numId w:val="2"/>
         </w:numPr>
-        <w:spacing w:line="276" w:lineRule="auto"/>
+        <w:spacing w:after="0" w:line="360" w:lineRule="auto"/>
         <w:rPr>
           <w:b/>
           <w:bCs/>
@@ -255,7 +261,32 @@
           <w:ilvl w:val="0"/>
           <w:numId w:val="5"/>
         </w:numPr>
-        <w:spacing w:line="276" w:lineRule="auto"/>
+        <w:spacing w:after="0" w:line="360" w:lineRule="auto"/>
+        <w:rPr>
+          <w:color w:val="FF0000"/>
+        </w:rPr>
+      </w:pPr>
+      <w:r>
+        <w:rPr>
+          <w:color w:val="FF0000"/>
+        </w:rPr>
+        <w:t>Ca</w:t>
+      </w:r>
+      <w:r>
+        <w:rPr>
+          <w:color w:val="FF0000"/>
+        </w:rPr>
+        <w:t>ntidad de Contratos</w:t>
+      </w:r>
+    </w:p>
+    <w:p>
+      <w:pPr>
+        <w:pStyle w:val="Prrafodelista"/>
+        <w:numPr>
+          <w:ilvl w:val="0"/>
+          <w:numId w:val="5"/>
+        </w:numPr>
+        <w:spacing w:after="0" w:line="360" w:lineRule="auto"/>
         <w:rPr>
           <w:highlight w:val="yellow"/>
         </w:rPr>
@@ -274,7 +305,7 @@
           <w:ilvl w:val="0"/>
           <w:numId w:val="5"/>
         </w:numPr>
-        <w:spacing w:line="276" w:lineRule="auto"/>
+        <w:spacing w:after="0" w:line="360" w:lineRule="auto"/>
         <w:rPr>
           <w:highlight w:val="yellow"/>
         </w:rPr>
@@ -301,7 +332,7 @@
           <w:ilvl w:val="0"/>
           <w:numId w:val="5"/>
         </w:numPr>
-        <w:spacing w:line="276" w:lineRule="auto"/>
+        <w:spacing w:after="0" w:line="360" w:lineRule="auto"/>
         <w:rPr>
           <w:highlight w:val="yellow"/>
         </w:rPr>
@@ -320,7 +351,7 @@
           <w:ilvl w:val="0"/>
           <w:numId w:val="5"/>
         </w:numPr>
-        <w:spacing w:line="276" w:lineRule="auto"/>
+        <w:spacing w:after="0" w:line="360" w:lineRule="auto"/>
         <w:rPr>
           <w:highlight w:val="yellow"/>
         </w:rPr>
@@ -334,18 +365,34 @@
     </w:p>
     <w:p>
       <w:pPr>
-        <w:spacing w:line="276" w:lineRule="auto"/>
+        <w:spacing w:after="0" w:line="360" w:lineRule="auto"/>
         <w:ind w:left="360"/>
-      </w:pPr>
-      <w:r>
+        <w:rPr>
+          <w:i/>
+          <w:iCs/>
+        </w:rPr>
+      </w:pPr>
+      <w:r>
+        <w:rPr>
+          <w:i/>
+          <w:iCs/>
+        </w:rPr>
         <w:t xml:space="preserve">Definir nosotros los </w:t>
       </w:r>
       <w:proofErr w:type="spellStart"/>
       <w:r>
+        <w:rPr>
+          <w:i/>
+          <w:iCs/>
+        </w:rPr>
         <w:t>kpi</w:t>
       </w:r>
       <w:proofErr w:type="spellEnd"/>
       <w:r>
+        <w:rPr>
+          <w:i/>
+          <w:iCs/>
+        </w:rPr>
         <w:t xml:space="preserve"> (tarea):</w:t>
       </w:r>
     </w:p>
@@ -356,17 +403,268 @@
           <w:ilvl w:val="0"/>
           <w:numId w:val="3"/>
         </w:numPr>
-        <w:spacing w:line="276" w:lineRule="auto"/>
+        <w:spacing w:after="0" w:line="360" w:lineRule="auto"/>
         <w:ind w:left="1080"/>
-      </w:pPr>
-      <w:r>
+        <w:rPr>
+          <w:i/>
+          <w:iCs/>
+        </w:rPr>
+      </w:pPr>
+      <w:r>
+        <w:rPr>
+          <w:i/>
+          <w:iCs/>
+        </w:rPr>
         <w:t>Tenemos que utilizar la técnica SMART</w:t>
       </w:r>
     </w:p>
     <w:p>
       <w:pPr>
         <w:pStyle w:val="Prrafodelista"/>
-        <w:spacing w:line="276" w:lineRule="auto"/>
+        <w:numPr>
+          <w:ilvl w:val="0"/>
+          <w:numId w:val="2"/>
+        </w:numPr>
+        <w:spacing w:after="0" w:line="360" w:lineRule="auto"/>
+        <w:rPr>
+          <w:b/>
+          <w:bCs/>
+        </w:rPr>
+      </w:pPr>
+      <w:r>
+        <w:rPr>
+          <w:b/>
+          <w:bCs/>
+        </w:rPr>
+        <w:t>Listar las Preguntas del Negocio que se deben responder</w:t>
+      </w:r>
+    </w:p>
+    <w:p>
+      <w:pPr>
+        <w:pStyle w:val="Prrafodelista"/>
+        <w:numPr>
+          <w:ilvl w:val="0"/>
+          <w:numId w:val="7"/>
+        </w:numPr>
+        <w:spacing w:after="0" w:line="360" w:lineRule="auto"/>
+        <w:rPr>
+          <w:highlight w:val="yellow"/>
+        </w:rPr>
+      </w:pPr>
+      <w:r>
+        <w:rPr>
+          <w:highlight w:val="yellow"/>
+        </w:rPr>
+        <w:t>Distribución de Empleados por Edad y Género</w:t>
+      </w:r>
+    </w:p>
+    <w:p>
+      <w:pPr>
+        <w:pStyle w:val="Prrafodelista"/>
+        <w:numPr>
+          <w:ilvl w:val="0"/>
+          <w:numId w:val="7"/>
+        </w:numPr>
+        <w:spacing w:after="0" w:line="360" w:lineRule="auto"/>
+        <w:rPr>
+          <w:highlight w:val="magenta"/>
+        </w:rPr>
+      </w:pPr>
+      <w:r>
+        <w:rPr>
+          <w:highlight w:val="magenta"/>
+        </w:rPr>
+        <w:t>Distribución de Empleados por Ubicación (</w:t>
+      </w:r>
+      <w:r>
+        <w:rPr>
+          <w:highlight w:val="magenta"/>
+        </w:rPr>
+        <w:t xml:space="preserve">Ciudad, </w:t>
+      </w:r>
+      <w:r>
+        <w:rPr>
+          <w:highlight w:val="magenta"/>
+        </w:rPr>
+        <w:t>estado)</w:t>
+      </w:r>
+    </w:p>
+    <w:p>
+      <w:pPr>
+        <w:pStyle w:val="Prrafodelista"/>
+        <w:numPr>
+          <w:ilvl w:val="0"/>
+          <w:numId w:val="7"/>
+        </w:numPr>
+        <w:spacing w:after="0" w:line="360" w:lineRule="auto"/>
+        <w:rPr>
+          <w:highlight w:val="magenta"/>
+        </w:rPr>
+      </w:pPr>
+      <w:r>
+        <w:rPr>
+          <w:highlight w:val="magenta"/>
+        </w:rPr>
+        <w:t>Sueldos x Ciudad / Condado / Estad</w:t>
+      </w:r>
+    </w:p>
+    <w:p>
+      <w:pPr>
+        <w:pStyle w:val="Prrafodelista"/>
+        <w:numPr>
+          <w:ilvl w:val="0"/>
+          <w:numId w:val="7"/>
+        </w:numPr>
+        <w:spacing w:after="0" w:line="360" w:lineRule="auto"/>
+        <w:rPr>
+          <w:highlight w:val="yellow"/>
+        </w:rPr>
+      </w:pPr>
+      <w:r>
+        <w:rPr>
+          <w:highlight w:val="yellow"/>
+        </w:rPr>
+        <w:t>Antigüedad de funcionarios</w:t>
+      </w:r>
+    </w:p>
+    <w:p>
+      <w:pPr>
+        <w:pStyle w:val="Prrafodelista"/>
+        <w:numPr>
+          <w:ilvl w:val="0"/>
+          <w:numId w:val="7"/>
+        </w:numPr>
+        <w:spacing w:after="0" w:line="360" w:lineRule="auto"/>
+        <w:rPr>
+          <w:highlight w:val="yellow"/>
+        </w:rPr>
+      </w:pPr>
+      <w:r>
+        <w:rPr>
+          <w:highlight w:val="yellow"/>
+        </w:rPr>
+        <w:t>Diferenciar el Género</w:t>
+      </w:r>
+      <w:r>
+        <w:rPr>
+          <w:highlight w:val="yellow"/>
+        </w:rPr>
+        <w:t xml:space="preserve"> de los Empleados</w:t>
+      </w:r>
+    </w:p>
+    <w:p>
+      <w:pPr>
+        <w:pStyle w:val="Prrafodelista"/>
+        <w:numPr>
+          <w:ilvl w:val="0"/>
+          <w:numId w:val="7"/>
+        </w:numPr>
+        <w:spacing w:after="0" w:line="360" w:lineRule="auto"/>
+        <w:rPr>
+          <w:highlight w:val="yellow"/>
+        </w:rPr>
+      </w:pPr>
+      <w:r>
+        <w:rPr>
+          <w:highlight w:val="yellow"/>
+        </w:rPr>
+        <w:lastRenderedPageBreak/>
+        <w:t xml:space="preserve">Número de </w:t>
+      </w:r>
+      <w:r>
+        <w:rPr>
+          <w:highlight w:val="yellow"/>
+        </w:rPr>
+        <w:t>Contrataciones por periodo (año, semestre, trimestre)</w:t>
+      </w:r>
+    </w:p>
+    <w:p>
+      <w:pPr>
+        <w:pStyle w:val="Prrafodelista"/>
+        <w:numPr>
+          <w:ilvl w:val="0"/>
+          <w:numId w:val="7"/>
+        </w:numPr>
+        <w:spacing w:after="0" w:line="360" w:lineRule="auto"/>
+        <w:rPr>
+          <w:color w:val="FF0000"/>
+        </w:rPr>
+      </w:pPr>
+      <w:r>
+        <w:rPr>
+          <w:color w:val="FF0000"/>
+        </w:rPr>
+        <w:t>Estado de Salud =&gt; Analizar el Peso</w:t>
+      </w:r>
+      <w:r>
+        <w:rPr>
+          <w:color w:val="FF0000"/>
+        </w:rPr>
+        <w:t xml:space="preserve"> (falta datos de altura del empleado)</w:t>
+      </w:r>
+    </w:p>
+    <w:p>
+      <w:pPr>
+        <w:pStyle w:val="Prrafodelista"/>
+        <w:numPr>
+          <w:ilvl w:val="0"/>
+          <w:numId w:val="7"/>
+        </w:numPr>
+        <w:spacing w:after="0" w:line="360" w:lineRule="auto"/>
+        <w:rPr>
+          <w:highlight w:val="cyan"/>
+        </w:rPr>
+      </w:pPr>
+      <w:r>
+        <w:rPr>
+          <w:highlight w:val="cyan"/>
+        </w:rPr>
+        <w:t>Costos laborales x ciudad (Donde tengo mayor costo)</w:t>
+      </w:r>
+    </w:p>
+    <w:p>
+      <w:pPr>
+        <w:pStyle w:val="Prrafodelista"/>
+        <w:numPr>
+          <w:ilvl w:val="0"/>
+          <w:numId w:val="7"/>
+        </w:numPr>
+        <w:spacing w:after="0" w:line="360" w:lineRule="auto"/>
+      </w:pPr>
+      <w:r>
+        <w:t>Relación entre antigüedad e incremento salarial</w:t>
+      </w:r>
+    </w:p>
+    <w:p>
+      <w:pPr>
+        <w:spacing w:after="0" w:line="360" w:lineRule="auto"/>
+      </w:pPr>
+    </w:p>
+    <w:p>
+      <w:pPr>
+        <w:pStyle w:val="Prrafodelista"/>
+        <w:numPr>
+          <w:ilvl w:val="0"/>
+          <w:numId w:val="2"/>
+        </w:numPr>
+        <w:spacing w:after="0" w:line="360" w:lineRule="auto"/>
+        <w:rPr>
+          <w:b/>
+          <w:bCs/>
+        </w:rPr>
+      </w:pPr>
+      <w:r>
+        <w:rPr>
+          <w:b/>
+          <w:bCs/>
+        </w:rPr>
+        <w:t>Diseñar el Modelo de Datos Dimensional</w:t>
+      </w:r>
+    </w:p>
+    <w:p>
+      <w:pPr>
+        <w:pStyle w:val="Prrafodelista"/>
+        <w:spacing w:after="0" w:line="360" w:lineRule="auto"/>
         <w:ind w:left="360"/>
       </w:pPr>
     </w:p>
@@ -377,188 +675,50 @@
           <w:ilvl w:val="0"/>
           <w:numId w:val="2"/>
         </w:numPr>
-        <w:spacing w:line="276" w:lineRule="auto"/>
-      </w:pPr>
-      <w:r>
-        <w:t>Listar las Preguntas del Negocio que se deben responder</w:t>
-      </w:r>
-    </w:p>
-    <w:p>
-      <w:pPr>
-        <w:pStyle w:val="Prrafodelista"/>
-        <w:numPr>
-          <w:ilvl w:val="0"/>
-          <w:numId w:val="7"/>
-        </w:numPr>
-        <w:spacing w:line="276" w:lineRule="auto"/>
-      </w:pPr>
-      <w:r>
-        <w:t>Distribución de Empleados por Edad y Género</w:t>
-      </w:r>
-    </w:p>
-    <w:p>
-      <w:pPr>
-        <w:pStyle w:val="Prrafodelista"/>
-        <w:numPr>
-          <w:ilvl w:val="0"/>
-          <w:numId w:val="7"/>
-        </w:numPr>
-        <w:spacing w:line="276" w:lineRule="auto"/>
-      </w:pPr>
-      <w:r>
-        <w:t>Distribución de Empleados por Ubicación (</w:t>
-      </w:r>
-      <w:r>
-        <w:t xml:space="preserve">Ciudad, </w:t>
-      </w:r>
-      <w:r>
-        <w:t>estado)</w:t>
-      </w:r>
-    </w:p>
-    <w:p>
-      <w:pPr>
-        <w:pStyle w:val="Prrafodelista"/>
-        <w:numPr>
-          <w:ilvl w:val="0"/>
-          <w:numId w:val="7"/>
-        </w:numPr>
-        <w:spacing w:line="276" w:lineRule="auto"/>
-      </w:pPr>
-      <w:r>
-        <w:t>Sueldos x Ciudad / Condado / Estad</w:t>
-      </w:r>
-    </w:p>
-    <w:p>
-      <w:pPr>
-        <w:pStyle w:val="Prrafodelista"/>
-        <w:numPr>
-          <w:ilvl w:val="0"/>
-          <w:numId w:val="7"/>
-        </w:numPr>
-        <w:spacing w:line="276" w:lineRule="auto"/>
-      </w:pPr>
-      <w:r>
-        <w:t>Antigüedad de funcionarios</w:t>
-      </w:r>
-    </w:p>
-    <w:p>
-      <w:pPr>
-        <w:pStyle w:val="Prrafodelista"/>
-        <w:numPr>
-          <w:ilvl w:val="0"/>
-          <w:numId w:val="7"/>
-        </w:numPr>
-        <w:spacing w:line="276" w:lineRule="auto"/>
-      </w:pPr>
-      <w:r>
-        <w:t>Diferenciar el Género</w:t>
-      </w:r>
-      <w:r>
-        <w:t xml:space="preserve"> de los Empleados</w:t>
-      </w:r>
-    </w:p>
-    <w:p>
-      <w:pPr>
-        <w:pStyle w:val="Prrafodelista"/>
-        <w:numPr>
-          <w:ilvl w:val="0"/>
-          <w:numId w:val="7"/>
-        </w:numPr>
-        <w:spacing w:line="276" w:lineRule="auto"/>
-        <w:rPr>
-          <w:highlight w:val="yellow"/>
-        </w:rPr>
-      </w:pPr>
-      <w:r>
-        <w:rPr>
-          <w:highlight w:val="yellow"/>
-        </w:rPr>
-        <w:t xml:space="preserve">Número de </w:t>
-      </w:r>
-      <w:r>
-        <w:rPr>
-          <w:highlight w:val="yellow"/>
-        </w:rPr>
-        <w:t>Contrataciones por periodo (año, semestre, trimestre)</w:t>
-      </w:r>
-    </w:p>
-    <w:p>
-      <w:pPr>
-        <w:pStyle w:val="Prrafodelista"/>
-        <w:numPr>
-          <w:ilvl w:val="0"/>
-          <w:numId w:val="7"/>
-        </w:numPr>
-        <w:spacing w:line="276" w:lineRule="auto"/>
-      </w:pPr>
-      <w:r>
-        <w:t>Estado de Salud =&gt; Analizar el Peso</w:t>
-      </w:r>
-    </w:p>
-    <w:p>
-      <w:pPr>
-        <w:pStyle w:val="Prrafodelista"/>
-        <w:numPr>
-          <w:ilvl w:val="0"/>
-          <w:numId w:val="7"/>
-        </w:numPr>
-        <w:spacing w:line="276" w:lineRule="auto"/>
-      </w:pPr>
-      <w:r>
-        <w:t>Costos laborales x ciudad (Donde tengo mayor costo)</w:t>
-      </w:r>
-    </w:p>
-    <w:p>
-      <w:pPr>
-        <w:pStyle w:val="Prrafodelista"/>
-        <w:numPr>
-          <w:ilvl w:val="0"/>
-          <w:numId w:val="2"/>
-        </w:numPr>
-        <w:spacing w:line="276" w:lineRule="auto"/>
-      </w:pPr>
-      <w:r>
-        <w:t>Diseñar el Modelo de Datos Dimensional</w:t>
-      </w:r>
-    </w:p>
-    <w:p>
-      <w:pPr>
-        <w:pStyle w:val="Prrafodelista"/>
-        <w:spacing w:line="276" w:lineRule="auto"/>
-        <w:ind w:left="360"/>
-      </w:pPr>
-    </w:p>
-    <w:p>
-      <w:pPr>
-        <w:pStyle w:val="Prrafodelista"/>
-        <w:numPr>
-          <w:ilvl w:val="0"/>
-          <w:numId w:val="2"/>
-        </w:numPr>
-        <w:spacing w:line="276" w:lineRule="auto"/>
-      </w:pPr>
-      <w:r>
+        <w:spacing w:after="0" w:line="360" w:lineRule="auto"/>
+        <w:rPr>
+          <w:b/>
+          <w:bCs/>
+        </w:rPr>
+      </w:pPr>
+      <w:r>
+        <w:rPr>
+          <w:b/>
+          <w:bCs/>
+        </w:rPr>
         <w:t xml:space="preserve">Realizar el Proceso ETL con </w:t>
       </w:r>
       <w:proofErr w:type="spellStart"/>
       <w:r>
+        <w:rPr>
+          <w:b/>
+          <w:bCs/>
+        </w:rPr>
         <w:t>Power</w:t>
       </w:r>
       <w:proofErr w:type="spellEnd"/>
       <w:r>
+        <w:rPr>
+          <w:b/>
+          <w:bCs/>
+        </w:rPr>
         <w:t xml:space="preserve"> QUERY</w:t>
       </w:r>
     </w:p>
     <w:p>
       <w:pPr>
         <w:pStyle w:val="Prrafodelista"/>
-      </w:pPr>
-    </w:p>
-    <w:p>
-      <w:pPr>
-        <w:spacing w:line="276" w:lineRule="auto"/>
-      </w:pPr>
-      <w:r>
+        <w:spacing w:after="0" w:line="360" w:lineRule="auto"/>
+      </w:pPr>
+    </w:p>
+    <w:p>
+      <w:pPr>
+        <w:spacing w:after="0" w:line="360" w:lineRule="auto"/>
+      </w:pPr>
+      <w:r>
+        <w:rPr>
+          <w:noProof/>
+        </w:rPr>
         <w:drawing>
           <wp:inline distT="0" distB="0" distL="0" distR="0" wp14:anchorId="6EFD0279" wp14:editId="194A0783">
             <wp:extent cx="5612130" cy="2455545"/>
@@ -599,6 +759,7 @@
     <w:p>
       <w:pPr>
         <w:pStyle w:val="Prrafodelista"/>
+        <w:spacing w:after="0" w:line="360" w:lineRule="auto"/>
       </w:pPr>
     </w:p>
     <w:p>
@@ -608,7 +769,7 @@
           <w:ilvl w:val="0"/>
           <w:numId w:val="2"/>
         </w:numPr>
-        <w:spacing w:line="276" w:lineRule="auto"/>
+        <w:spacing w:after="0" w:line="360" w:lineRule="auto"/>
       </w:pPr>
       <w:r>
         <w:t>Implementar las métricas</w:t>

</xml_diff>